<commit_message>
updated Homework2 with hypotheshis, screenshots, and conclusion
</commit_message>
<xml_diff>
--- a/Homework2.docx
+++ b/Homework2.docx
@@ -3,12 +3,30 @@
 <w:document xmlns:wpc="http://schemas.microsoft.com/office/word/2010/wordprocessingCanvas" xmlns:cx="http://schemas.microsoft.com/office/drawing/2014/chartex" xmlns:cx1="http://schemas.microsoft.com/office/drawing/2015/9/8/chartex" xmlns:cx2="http://schemas.microsoft.com/office/drawing/2015/10/21/chartex" xmlns:cx3="http://schemas.microsoft.com/office/drawing/2016/5/9/chartex" xmlns:cx4="http://schemas.microsoft.com/office/drawing/2016/5/10/chartex" xmlns:cx5="http://schemas.microsoft.com/office/drawing/2016/5/11/chartex" xmlns:cx6="http://schemas.microsoft.com/office/drawing/2016/5/12/chartex" xmlns:cx7="http://schemas.microsoft.com/office/drawing/2016/5/13/chartex" xmlns:cx8="http://schemas.microsoft.com/office/drawing/2016/5/14/chartex" xmlns:mc="http://schemas.openxmlformats.org/markup-compatibility/2006" xmlns:aink="http://schemas.microsoft.com/office/drawing/2016/ink" xmlns:am3d="http://schemas.microsoft.com/office/drawing/2017/model3d" xmlns:o="urn:schemas-microsoft-com:office:office" xmlns:oel="http://schemas.microsoft.com/office/2019/extlst" xmlns:r="http://schemas.openxmlformats.org/officeDocument/2006/relationships" xmlns:m="http://schemas.openxmlformats.org/officeDocument/2006/math" xmlns:v="urn:schemas-microsoft-com:vml" xmlns:wp14="http://schemas.microsoft.com/office/word/2010/wordprocessingDrawing" xmlns:wp="http://schemas.openxmlformats.org/drawingml/2006/wordprocessingDrawing" xmlns:w10="urn:schemas-microsoft-com:office:word" xmlns:w="http://schemas.openxmlformats.org/wordprocessingml/2006/main" xmlns:w14="http://schemas.microsoft.com/office/word/2010/wordml" xmlns:w15="http://schemas.microsoft.com/office/word/2012/wordml" xmlns:w16cex="http://schemas.microsoft.com/office/word/2018/wordml/cex" xmlns:w16cid="http://schemas.microsoft.com/office/word/2016/wordml/cid" xmlns:w16="http://schemas.microsoft.com/office/word/2018/wordml" xmlns:w16du="http://schemas.microsoft.com/office/word/2023/wordml/word16du" xmlns:w16sdtdh="http://schemas.microsoft.com/office/word/2020/wordml/sdtdatahash" xmlns:w16sdtfl="http://schemas.microsoft.com/office/word/2024/wordml/sdtformatlock" xmlns:w16se="http://schemas.microsoft.com/office/word/2015/wordml/symex" xmlns:wpg="http://schemas.microsoft.com/office/word/2010/wordprocessingGroup" xmlns:wpi="http://schemas.microsoft.com/office/word/2010/wordprocessingInk" xmlns:wne="http://schemas.microsoft.com/office/word/2006/wordml" xmlns:wps="http://schemas.microsoft.com/office/word/2010/wordprocessingShape" mc:Ignorable="w14 w15 w16se w16cid w16 w16cex w16sdtdh w16sdtfl w16du wp14">
   <w:body>
     <w:p>
-      <w:r>
+      <w:pPr>
+        <w:rPr>
+          <w:b/>
+          <w:bCs/>
+        </w:rPr>
+      </w:pPr>
+      <w:r>
+        <w:rPr>
+          <w:b/>
+          <w:bCs/>
+          <w:highlight w:val="yellow"/>
+        </w:rPr>
         <w:t>Hypothesis:</w:t>
       </w:r>
     </w:p>
     <w:p>
       <w:pPr>
+        <w:pBdr>
+          <w:top w:val="single" w:sz="4" w:space="1" w:color="auto"/>
+          <w:left w:val="single" w:sz="4" w:space="4" w:color="auto"/>
+          <w:bottom w:val="single" w:sz="4" w:space="1" w:color="auto"/>
+          <w:right w:val="single" w:sz="4" w:space="4" w:color="auto"/>
+        </w:pBdr>
+        <w:shd w:val="clear" w:color="auto" w:fill="F6C5AC" w:themeFill="accent2" w:themeFillTint="66"/>
         <w:rPr>
           <w:b/>
           <w:bCs/>
@@ -29,18 +47,63 @@
           <w:bCs/>
         </w:rPr>
       </w:pPr>
-    </w:p>
-    <w:p>
-      <w:pPr>
-        <w:rPr>
-          <w:b/>
-          <w:bCs/>
-        </w:rPr>
-      </w:pPr>
-      <w:r>
-        <w:rPr>
-          <w:b/>
-          <w:bCs/>
+      <w:r>
+        <w:rPr>
+          <w:b/>
+          <w:bCs/>
+        </w:rPr>
+        <w:t>Approach:</w:t>
+      </w:r>
+    </w:p>
+    <w:p>
+      <w:pPr>
+        <w:pBdr>
+          <w:top w:val="single" w:sz="4" w:space="1" w:color="auto"/>
+          <w:left w:val="single" w:sz="4" w:space="4" w:color="auto"/>
+          <w:bottom w:val="single" w:sz="4" w:space="1" w:color="auto"/>
+          <w:right w:val="single" w:sz="4" w:space="4" w:color="auto"/>
+        </w:pBdr>
+        <w:shd w:val="clear" w:color="auto" w:fill="60CAF3" w:themeFill="accent4" w:themeFillTint="99"/>
+        <w:rPr>
+          <w:b/>
+          <w:bCs/>
+        </w:rPr>
+      </w:pPr>
+      <w:r>
+        <w:rPr>
+          <w:b/>
+          <w:bCs/>
+        </w:rPr>
+        <w:t>Compare the unemployment rate of these states in 2019 to that in 2020, the peak phase OF COVID-19,  and that in 2021, the recovery phase after COVID-19</w:t>
+      </w:r>
+    </w:p>
+    <w:p>
+      <w:pPr>
+        <w:jc w:val="center"/>
+        <w:rPr>
+          <w:b/>
+          <w:bCs/>
+        </w:rPr>
+      </w:pPr>
+    </w:p>
+    <w:p>
+      <w:pPr>
+        <w:jc w:val="center"/>
+        <w:rPr>
+          <w:b/>
+          <w:bCs/>
+          <w:color w:val="E97132" w:themeColor="accent2"/>
+          <w:sz w:val="26"/>
+          <w:szCs w:val="26"/>
+        </w:rPr>
+      </w:pPr>
+      <w:r>
+        <w:rPr>
+          <w:b/>
+          <w:bCs/>
+          <w:color w:val="E97132" w:themeColor="accent2"/>
+          <w:sz w:val="26"/>
+          <w:szCs w:val="26"/>
         </w:rPr>
         <w:t>Using Spark/Data Frame</w:t>
       </w:r>
@@ -53,7 +116,543 @@
         </w:rPr>
       </w:pPr>
     </w:p>
-    <w:p/>
+    <w:p>
+      <w:pPr>
+        <w:rPr>
+          <w:b/>
+          <w:bCs/>
+        </w:rPr>
+      </w:pPr>
+      <w:r>
+        <w:rPr>
+          <w:b/>
+          <w:bCs/>
+        </w:rPr>
+        <w:drawing>
+          <wp:inline distT="0" distB="0" distL="0" distR="0" wp14:anchorId="74F06192" wp14:editId="6D6B9F88">
+            <wp:extent cx="5943600" cy="2688590"/>
+            <wp:effectExtent l="0" t="0" r="0" b="0"/>
+            <wp:docPr id="918742115" name="Picture 1"/>
+            <wp:cNvGraphicFramePr>
+              <a:graphicFrameLocks xmlns:a="http://schemas.openxmlformats.org/drawingml/2006/main" noChangeAspect="1"/>
+            </wp:cNvGraphicFramePr>
+            <a:graphic xmlns:a="http://schemas.openxmlformats.org/drawingml/2006/main">
+              <a:graphicData uri="http://schemas.openxmlformats.org/drawingml/2006/picture">
+                <pic:pic xmlns:pic="http://schemas.openxmlformats.org/drawingml/2006/picture">
+                  <pic:nvPicPr>
+                    <pic:cNvPr id="918742115" name=""/>
+                    <pic:cNvPicPr/>
+                  </pic:nvPicPr>
+                  <pic:blipFill>
+                    <a:blip r:embed="rId4"/>
+                    <a:stretch>
+                      <a:fillRect/>
+                    </a:stretch>
+                  </pic:blipFill>
+                  <pic:spPr>
+                    <a:xfrm>
+                      <a:off x="0" y="0"/>
+                      <a:ext cx="5943600" cy="2688590"/>
+                    </a:xfrm>
+                    <a:prstGeom prst="rect">
+                      <a:avLst/>
+                    </a:prstGeom>
+                  </pic:spPr>
+                </pic:pic>
+              </a:graphicData>
+            </a:graphic>
+          </wp:inline>
+        </w:drawing>
+      </w:r>
+    </w:p>
+    <w:p>
+      <w:pPr>
+        <w:rPr>
+          <w:b/>
+          <w:bCs/>
+        </w:rPr>
+      </w:pPr>
+    </w:p>
+    <w:p>
+      <w:pPr>
+        <w:rPr>
+          <w:b/>
+          <w:bCs/>
+          <w:color w:val="E97132" w:themeColor="accent2"/>
+        </w:rPr>
+      </w:pPr>
+      <w:r>
+        <w:rPr>
+          <w:b/>
+          <w:bCs/>
+          <w:color w:val="E97132" w:themeColor="accent2"/>
+        </w:rPr>
+        <w:t>Select the necessary columns for analyzing, especially in NumUnemployed and NumCivlLaborForce in 2019 - 2021</w:t>
+      </w:r>
+    </w:p>
+    <w:p>
+      <w:pPr>
+        <w:rPr>
+          <w:b/>
+          <w:bCs/>
+        </w:rPr>
+      </w:pPr>
+      <w:r>
+        <w:rPr>
+          <w:b/>
+          <w:bCs/>
+        </w:rPr>
+        <w:lastRenderedPageBreak/>
+        <w:drawing>
+          <wp:inline distT="0" distB="0" distL="0" distR="0" wp14:anchorId="0177859C" wp14:editId="506F188B">
+            <wp:extent cx="5943600" cy="2118360"/>
+            <wp:effectExtent l="0" t="0" r="0" b="0"/>
+            <wp:docPr id="1149767629" name="Picture 1"/>
+            <wp:cNvGraphicFramePr>
+              <a:graphicFrameLocks xmlns:a="http://schemas.openxmlformats.org/drawingml/2006/main" noChangeAspect="1"/>
+            </wp:cNvGraphicFramePr>
+            <a:graphic xmlns:a="http://schemas.openxmlformats.org/drawingml/2006/main">
+              <a:graphicData uri="http://schemas.openxmlformats.org/drawingml/2006/picture">
+                <pic:pic xmlns:pic="http://schemas.openxmlformats.org/drawingml/2006/picture">
+                  <pic:nvPicPr>
+                    <pic:cNvPr id="1149767629" name=""/>
+                    <pic:cNvPicPr/>
+                  </pic:nvPicPr>
+                  <pic:blipFill>
+                    <a:blip r:embed="rId5"/>
+                    <a:stretch>
+                      <a:fillRect/>
+                    </a:stretch>
+                  </pic:blipFill>
+                  <pic:spPr>
+                    <a:xfrm>
+                      <a:off x="0" y="0"/>
+                      <a:ext cx="5943600" cy="2118360"/>
+                    </a:xfrm>
+                    <a:prstGeom prst="rect">
+                      <a:avLst/>
+                    </a:prstGeom>
+                  </pic:spPr>
+                </pic:pic>
+              </a:graphicData>
+            </a:graphic>
+          </wp:inline>
+        </w:drawing>
+      </w:r>
+    </w:p>
+    <w:p>
+      <w:pPr>
+        <w:rPr>
+          <w:b/>
+          <w:bCs/>
+        </w:rPr>
+      </w:pPr>
+    </w:p>
+    <w:p>
+      <w:pPr>
+        <w:rPr>
+          <w:b/>
+          <w:bCs/>
+          <w:color w:val="E97132" w:themeColor="accent2"/>
+        </w:rPr>
+      </w:pPr>
+      <w:r>
+        <w:rPr>
+          <w:b/>
+          <w:bCs/>
+          <w:color w:val="E97132" w:themeColor="accent2"/>
+        </w:rPr>
+        <w:t>Filter rows that consist of such states as Nevada, Hawaii, California, and Washington</w:t>
+      </w:r>
+    </w:p>
+    <w:p>
+      <w:pPr>
+        <w:rPr>
+          <w:b/>
+          <w:bCs/>
+        </w:rPr>
+      </w:pPr>
+      <w:r>
+        <w:rPr>
+          <w:b/>
+          <w:bCs/>
+        </w:rPr>
+        <w:drawing>
+          <wp:inline distT="0" distB="0" distL="0" distR="0" wp14:anchorId="2F65BFE5" wp14:editId="5790D1FE">
+            <wp:extent cx="5581650" cy="2099082"/>
+            <wp:effectExtent l="0" t="0" r="0" b="0"/>
+            <wp:docPr id="910049989" name="Picture 1"/>
+            <wp:cNvGraphicFramePr>
+              <a:graphicFrameLocks xmlns:a="http://schemas.openxmlformats.org/drawingml/2006/main" noChangeAspect="1"/>
+            </wp:cNvGraphicFramePr>
+            <a:graphic xmlns:a="http://schemas.openxmlformats.org/drawingml/2006/main">
+              <a:graphicData uri="http://schemas.openxmlformats.org/drawingml/2006/picture">
+                <pic:pic xmlns:pic="http://schemas.openxmlformats.org/drawingml/2006/picture">
+                  <pic:nvPicPr>
+                    <pic:cNvPr id="910049989" name=""/>
+                    <pic:cNvPicPr/>
+                  </pic:nvPicPr>
+                  <pic:blipFill>
+                    <a:blip r:embed="rId6"/>
+                    <a:stretch>
+                      <a:fillRect/>
+                    </a:stretch>
+                  </pic:blipFill>
+                  <pic:spPr>
+                    <a:xfrm>
+                      <a:off x="0" y="0"/>
+                      <a:ext cx="5591389" cy="2102745"/>
+                    </a:xfrm>
+                    <a:prstGeom prst="rect">
+                      <a:avLst/>
+                    </a:prstGeom>
+                  </pic:spPr>
+                </pic:pic>
+              </a:graphicData>
+            </a:graphic>
+          </wp:inline>
+        </w:drawing>
+      </w:r>
+    </w:p>
+    <w:p>
+      <w:pPr>
+        <w:rPr>
+          <w:b/>
+          <w:bCs/>
+        </w:rPr>
+      </w:pPr>
+    </w:p>
+    <w:p>
+      <w:pPr>
+        <w:ind w:firstLine="720"/>
+        <w:rPr>
+          <w:b/>
+          <w:bCs/>
+          <w:color w:val="E97132" w:themeColor="accent2"/>
+        </w:rPr>
+      </w:pPr>
+      <w:r>
+        <w:rPr>
+          <w:b/>
+          <w:bCs/>
+          <w:color w:val="E97132" w:themeColor="accent2"/>
+        </w:rPr>
+        <w:t>Create the UnemploymentRate column by dividing the NumUnemployed column by the NumCivlLaborforce column and multiplying by 100</w:t>
+      </w:r>
+      <w:r>
+        <w:rPr>
+          <w:b/>
+          <w:bCs/>
+          <w:color w:val="E97132" w:themeColor="accent2"/>
+        </w:rPr>
+        <w:t xml:space="preserve">. </w:t>
+      </w:r>
+    </w:p>
+    <w:p>
+      <w:pPr>
+        <w:ind w:firstLine="720"/>
+        <w:rPr>
+          <w:b/>
+          <w:bCs/>
+          <w:color w:val="E97132" w:themeColor="accent2"/>
+        </w:rPr>
+      </w:pPr>
+      <w:r>
+        <w:rPr>
+          <w:b/>
+          <w:bCs/>
+          <w:color w:val="E97132" w:themeColor="accent2"/>
+        </w:rPr>
+        <w:t>Round the values in UnemploymentRate column to 2 decimal places</w:t>
+      </w:r>
+    </w:p>
+    <w:p>
+      <w:pPr>
+        <w:rPr>
+          <w:b/>
+          <w:bCs/>
+          <w:color w:val="E97132" w:themeColor="accent2"/>
+        </w:rPr>
+      </w:pPr>
+      <w:r>
+        <w:rPr>
+          <w:b/>
+          <w:bCs/>
+          <w:color w:val="E97132" w:themeColor="accent2"/>
+        </w:rPr>
+        <w:lastRenderedPageBreak/>
+        <w:drawing>
+          <wp:inline distT="0" distB="0" distL="0" distR="0" wp14:anchorId="4E53275E" wp14:editId="59774D32">
+            <wp:extent cx="5505450" cy="2172771"/>
+            <wp:effectExtent l="0" t="0" r="0" b="0"/>
+            <wp:docPr id="2128265221" name="Picture 1"/>
+            <wp:cNvGraphicFramePr>
+              <a:graphicFrameLocks xmlns:a="http://schemas.openxmlformats.org/drawingml/2006/main" noChangeAspect="1"/>
+            </wp:cNvGraphicFramePr>
+            <a:graphic xmlns:a="http://schemas.openxmlformats.org/drawingml/2006/main">
+              <a:graphicData uri="http://schemas.openxmlformats.org/drawingml/2006/picture">
+                <pic:pic xmlns:pic="http://schemas.openxmlformats.org/drawingml/2006/picture">
+                  <pic:nvPicPr>
+                    <pic:cNvPr id="2128265221" name=""/>
+                    <pic:cNvPicPr/>
+                  </pic:nvPicPr>
+                  <pic:blipFill>
+                    <a:blip r:embed="rId7"/>
+                    <a:stretch>
+                      <a:fillRect/>
+                    </a:stretch>
+                  </pic:blipFill>
+                  <pic:spPr>
+                    <a:xfrm>
+                      <a:off x="0" y="0"/>
+                      <a:ext cx="5520669" cy="2178777"/>
+                    </a:xfrm>
+                    <a:prstGeom prst="rect">
+                      <a:avLst/>
+                    </a:prstGeom>
+                  </pic:spPr>
+                </pic:pic>
+              </a:graphicData>
+            </a:graphic>
+          </wp:inline>
+        </w:drawing>
+      </w:r>
+    </w:p>
+    <w:p>
+      <w:pPr>
+        <w:rPr>
+          <w:b/>
+          <w:bCs/>
+          <w:color w:val="E97132" w:themeColor="accent2"/>
+        </w:rPr>
+      </w:pPr>
+      <w:r>
+        <w:rPr>
+          <w:b/>
+          <w:bCs/>
+          <w:color w:val="E97132" w:themeColor="accent2"/>
+        </w:rPr>
+        <w:t>Showcase the table</w:t>
+      </w:r>
+    </w:p>
+    <w:p>
+      <w:pPr>
+        <w:rPr>
+          <w:b/>
+          <w:bCs/>
+        </w:rPr>
+      </w:pPr>
+      <w:r>
+        <w:rPr>
+          <w:b/>
+          <w:bCs/>
+        </w:rPr>
+        <w:drawing>
+          <wp:inline distT="0" distB="0" distL="0" distR="0" wp14:anchorId="5A561780" wp14:editId="23DE33C4">
+            <wp:extent cx="5943600" cy="1350645"/>
+            <wp:effectExtent l="0" t="0" r="0" b="1905"/>
+            <wp:docPr id="369752494" name="Picture 1"/>
+            <wp:cNvGraphicFramePr>
+              <a:graphicFrameLocks xmlns:a="http://schemas.openxmlformats.org/drawingml/2006/main" noChangeAspect="1"/>
+            </wp:cNvGraphicFramePr>
+            <a:graphic xmlns:a="http://schemas.openxmlformats.org/drawingml/2006/main">
+              <a:graphicData uri="http://schemas.openxmlformats.org/drawingml/2006/picture">
+                <pic:pic xmlns:pic="http://schemas.openxmlformats.org/drawingml/2006/picture">
+                  <pic:nvPicPr>
+                    <pic:cNvPr id="369752494" name=""/>
+                    <pic:cNvPicPr/>
+                  </pic:nvPicPr>
+                  <pic:blipFill>
+                    <a:blip r:embed="rId8"/>
+                    <a:stretch>
+                      <a:fillRect/>
+                    </a:stretch>
+                  </pic:blipFill>
+                  <pic:spPr>
+                    <a:xfrm>
+                      <a:off x="0" y="0"/>
+                      <a:ext cx="5943600" cy="1350645"/>
+                    </a:xfrm>
+                    <a:prstGeom prst="rect">
+                      <a:avLst/>
+                    </a:prstGeom>
+                  </pic:spPr>
+                </pic:pic>
+              </a:graphicData>
+            </a:graphic>
+          </wp:inline>
+        </w:drawing>
+      </w:r>
+    </w:p>
+    <w:p>
+      <w:pPr>
+        <w:rPr>
+          <w:b/>
+          <w:bCs/>
+        </w:rPr>
+      </w:pPr>
+      <w:r>
+        <w:rPr>
+          <w:b/>
+          <w:bCs/>
+          <w:color w:val="E97132" w:themeColor="accent2"/>
+        </w:rPr>
+        <w:t>Plot the bar chart of the UnemploymentRate</w:t>
+      </w:r>
+    </w:p>
+    <w:p>
+      <w:pPr>
+        <w:rPr>
+          <w:b/>
+          <w:bCs/>
+        </w:rPr>
+      </w:pPr>
+      <w:r>
+        <w:rPr>
+          <w:b/>
+          <w:bCs/>
+        </w:rPr>
+        <w:drawing>
+          <wp:inline distT="0" distB="0" distL="0" distR="0" wp14:anchorId="67D07480" wp14:editId="4732B2AB">
+            <wp:extent cx="3873500" cy="3316987"/>
+            <wp:effectExtent l="0" t="0" r="0" b="0"/>
+            <wp:docPr id="583940041" name="Picture 1"/>
+            <wp:cNvGraphicFramePr>
+              <a:graphicFrameLocks xmlns:a="http://schemas.openxmlformats.org/drawingml/2006/main" noChangeAspect="1"/>
+            </wp:cNvGraphicFramePr>
+            <a:graphic xmlns:a="http://schemas.openxmlformats.org/drawingml/2006/main">
+              <a:graphicData uri="http://schemas.openxmlformats.org/drawingml/2006/picture">
+                <pic:pic xmlns:pic="http://schemas.openxmlformats.org/drawingml/2006/picture">
+                  <pic:nvPicPr>
+                    <pic:cNvPr id="583940041" name=""/>
+                    <pic:cNvPicPr/>
+                  </pic:nvPicPr>
+                  <pic:blipFill rotWithShape="1">
+                    <a:blip r:embed="rId9"/>
+                    <a:srcRect r="23183"/>
+                    <a:stretch>
+                      <a:fillRect/>
+                    </a:stretch>
+                  </pic:blipFill>
+                  <pic:spPr bwMode="auto">
+                    <a:xfrm>
+                      <a:off x="0" y="0"/>
+                      <a:ext cx="3881945" cy="3324219"/>
+                    </a:xfrm>
+                    <a:prstGeom prst="rect">
+                      <a:avLst/>
+                    </a:prstGeom>
+                    <a:ln>
+                      <a:noFill/>
+                    </a:ln>
+                    <a:extLst>
+                      <a:ext uri="{53640926-AAD7-44D8-BBD7-CCE9431645EC}">
+                        <a14:shadowObscured xmlns:a14="http://schemas.microsoft.com/office/drawing/2010/main"/>
+                      </a:ext>
+                    </a:extLst>
+                  </pic:spPr>
+                </pic:pic>
+              </a:graphicData>
+            </a:graphic>
+          </wp:inline>
+        </w:drawing>
+      </w:r>
+    </w:p>
+    <w:p>
+      <w:pPr>
+        <w:rPr>
+          <w:b/>
+          <w:bCs/>
+        </w:rPr>
+      </w:pPr>
+    </w:p>
+    <w:p>
+      <w:pPr>
+        <w:pBdr>
+          <w:top w:val="single" w:sz="4" w:space="1" w:color="auto"/>
+          <w:left w:val="single" w:sz="4" w:space="4" w:color="auto"/>
+          <w:bottom w:val="single" w:sz="4" w:space="1" w:color="auto"/>
+          <w:right w:val="single" w:sz="4" w:space="4" w:color="auto"/>
+        </w:pBdr>
+        <w:shd w:val="clear" w:color="auto" w:fill="B3E5A1" w:themeFill="accent6" w:themeFillTint="66"/>
+        <w:rPr>
+          <w:b/>
+          <w:bCs/>
+        </w:rPr>
+      </w:pPr>
+      <w:r>
+        <w:rPr>
+          <w:b/>
+          <w:bCs/>
+        </w:rPr>
+        <w:lastRenderedPageBreak/>
+        <w:t>CONCLUSION: My hypothesis is correct</w:t>
+      </w:r>
+    </w:p>
+    <w:p>
+      <w:pPr>
+        <w:ind w:firstLine="720"/>
+      </w:pPr>
+      <w:r>
+        <w:t>My hypothesis is correct and it is not different from the hypothesis in Homework1</w:t>
+      </w:r>
+    </w:p>
+    <w:p>
+      <w:pPr>
+        <w:ind w:firstLine="720"/>
+      </w:pPr>
+      <w:r>
+        <w:t>In 2020, at the peak of the COVID-19 pandemic, tourism-dependent states such as Nevada and Hawaii were severely affected. Consequently, Hawaii’s unemployment rate surged from 2.45% in 2019 to 12% in 2020, while Nevada’s rate climbed from 4.02% to 13.52%. Although tech-driven states like California and Washington also experienced increases in unemployment, the impact was less severe.</w:t>
+      </w:r>
+    </w:p>
+    <w:p>
+      <w:pPr>
+        <w:ind w:firstLine="720"/>
+      </w:pPr>
+      <w:r>
+        <w:t>I</w:t>
+      </w:r>
+      <w:r>
+        <w:t>n 2021, during the recovery phase following the COVID-19 pandemic, all states experienced economic improvement as unemployment rates decreased significantly. Although travel demand began to recover, the unemployment rates in tourism-dependent states did not decline as rapidly as those in tech-driven states. Notably, Washington recorded the lowest unemployment rate in the group at 5.23%, while California demonstrated greater stability within its downward trend, maintaining an unemployment rate of 7.30%</w:t>
+      </w:r>
+    </w:p>
+    <w:p>
+      <w:pPr>
+        <w:ind w:firstLine="720"/>
+      </w:pPr>
+    </w:p>
+    <w:p>
+      <w:pPr>
+        <w:ind w:firstLine="720"/>
+        <w:rPr>
+          <w:b/>
+          <w:bCs/>
+        </w:rPr>
+      </w:pPr>
+      <w:r>
+        <w:rPr>
+          <w:b/>
+          <w:bCs/>
+          <w:highlight w:val="yellow"/>
+        </w:rPr>
+        <w:t>Link of Spark:</w:t>
+      </w:r>
+    </w:p>
+    <w:p>
+      <w:r>
+        <w:t>http://172.20.2.115:8000/user/analytics4220/notebooks/Ba/Spark_Homework2.ipynb</w:t>
+      </w:r>
+    </w:p>
+    <w:p>
+      <w:pPr>
+        <w:ind w:firstLine="720"/>
+      </w:pPr>
+    </w:p>
+    <w:p>
+      <w:pPr>
+        <w:ind w:firstLine="720"/>
+      </w:pPr>
+    </w:p>
     <w:sectPr>
       <w:pgSz w:w="12240" w:h="15840"/>
       <w:pgMar w:top="1440" w:right="1440" w:bottom="1440" w:left="1440" w:header="720" w:footer="720" w:gutter="0"/>
@@ -668,7 +1267,6 @@
   <w:style w:type="character" w:default="1" w:styleId="DefaultParagraphFont">
     <w:name w:val="Default Paragraph Font"/>
     <w:uiPriority w:val="1"/>
-    <w:semiHidden/>
     <w:unhideWhenUsed/>
   </w:style>
   <w:style w:type="table" w:default="1" w:styleId="TableNormal">

</xml_diff>

<commit_message>
add github link and jupiterhub link
</commit_message>
<xml_diff>
--- a/Homework2.docx
+++ b/Homework2.docx
@@ -127,6 +127,7 @@
         <w:rPr>
           <w:b/>
           <w:bCs/>
+          <w:noProof/>
         </w:rPr>
         <w:drawing>
           <wp:inline distT="0" distB="0" distL="0" distR="0" wp14:anchorId="74F06192" wp14:editId="6D6B9F88">
@@ -201,6 +202,7 @@
         <w:rPr>
           <w:b/>
           <w:bCs/>
+          <w:noProof/>
         </w:rPr>
         <w:lastRenderedPageBreak/>
         <w:drawing>
@@ -276,6 +278,7 @@
         <w:rPr>
           <w:b/>
           <w:bCs/>
+          <w:noProof/>
         </w:rPr>
         <w:drawing>
           <wp:inline distT="0" distB="0" distL="0" distR="0" wp14:anchorId="2F65BFE5" wp14:editId="5790D1FE">
@@ -378,6 +381,7 @@
         <w:rPr>
           <w:b/>
           <w:bCs/>
+          <w:noProof/>
           <w:color w:val="E97132" w:themeColor="accent2"/>
         </w:rPr>
         <w:lastRenderedPageBreak/>
@@ -446,6 +450,7 @@
         <w:rPr>
           <w:b/>
           <w:bCs/>
+          <w:noProof/>
         </w:rPr>
         <w:drawing>
           <wp:inline distT="0" distB="0" distL="0" distR="0" wp14:anchorId="5A561780" wp14:editId="23DE33C4">
@@ -511,6 +516,7 @@
         <w:rPr>
           <w:b/>
           <w:bCs/>
+          <w:noProof/>
         </w:rPr>
         <w:drawing>
           <wp:inline distT="0" distB="0" distL="0" distR="0" wp14:anchorId="67D07480" wp14:editId="4732B2AB">
@@ -623,7 +629,6 @@
     </w:p>
     <w:p>
       <w:pPr>
-        <w:ind w:firstLine="720"/>
         <w:rPr>
           <w:b/>
           <w:bCs/>
@@ -639,15 +644,45 @@
       </w:r>
     </w:p>
     <w:p>
-      <w:r>
-        <w:t>http://172.20.2.115:8000/user/analytics4220/notebooks/Ba/Spark_Homework2.ipynb</w:t>
-      </w:r>
-    </w:p>
-    <w:p>
-      <w:pPr>
-        <w:ind w:firstLine="720"/>
-      </w:pPr>
-    </w:p>
+      <w:hyperlink r:id="rId10" w:history="1">
+        <w:r>
+          <w:rPr>
+            <w:rStyle w:val="Hyperlink"/>
+          </w:rPr>
+          <w:t>http://172.20.2.115:8000/user/analytics4220/notebooks/Ba/Spark_Homework2.ipynb</w:t>
+        </w:r>
+      </w:hyperlink>
+      <w:r>
+        <w:t xml:space="preserve"> </w:t>
+      </w:r>
+    </w:p>
+    <w:p>
+      <w:pPr>
+        <w:rPr>
+          <w:b/>
+          <w:bCs/>
+        </w:rPr>
+      </w:pPr>
+      <w:r>
+        <w:rPr>
+          <w:b/>
+          <w:bCs/>
+          <w:highlight w:val="yellow"/>
+        </w:rPr>
+        <w:t>Link of Github:</w:t>
+      </w:r>
+    </w:p>
+    <w:p>
+      <w:hyperlink r:id="rId11" w:history="1">
+        <w:r>
+          <w:rPr>
+            <w:rStyle w:val="Hyperlink"/>
+          </w:rPr>
+          <w:t>https://github.com/bahoangpham/HW1_data_intensive_class</w:t>
+        </w:r>
+      </w:hyperlink>
+    </w:p>
+    <w:p/>
     <w:p>
       <w:pPr>
         <w:ind w:firstLine="720"/>
@@ -1267,6 +1302,7 @@
   <w:style w:type="character" w:default="1" w:styleId="DefaultParagraphFont">
     <w:name w:val="Default Paragraph Font"/>
     <w:uiPriority w:val="1"/>
+    <w:semiHidden/>
     <w:unhideWhenUsed/>
   </w:style>
   <w:style w:type="table" w:default="1" w:styleId="TableNormal">
@@ -1578,6 +1614,29 @@
       <w:smallCaps/>
       <w:color w:val="0F4761" w:themeColor="accent1" w:themeShade="BF"/>
       <w:spacing w:val="5"/>
+    </w:rPr>
+  </w:style>
+  <w:style w:type="character" w:styleId="Hyperlink">
+    <w:name w:val="Hyperlink"/>
+    <w:basedOn w:val="DefaultParagraphFont"/>
+    <w:uiPriority w:val="99"/>
+    <w:unhideWhenUsed/>
+    <w:rsid w:val="006A05CF"/>
+    <w:rPr>
+      <w:color w:val="467886" w:themeColor="hyperlink"/>
+      <w:u w:val="single"/>
+    </w:rPr>
+  </w:style>
+  <w:style w:type="character" w:styleId="UnresolvedMention">
+    <w:name w:val="Unresolved Mention"/>
+    <w:basedOn w:val="DefaultParagraphFont"/>
+    <w:uiPriority w:val="99"/>
+    <w:semiHidden/>
+    <w:unhideWhenUsed/>
+    <w:rsid w:val="006A05CF"/>
+    <w:rPr>
+      <w:color w:val="605E5C"/>
+      <w:shd w:val="clear" w:color="auto" w:fill="E1DFDD"/>
     </w:rPr>
   </w:style>
 </w:styles>

</xml_diff>